<commit_message>
Date 21 print ready
</commit_message>
<xml_diff>
--- a/Received/lkg/lkg, english.docx
+++ b/Received/lkg/lkg, english.docx
@@ -272,27 +272,7 @@
           <w:sz w:val="24"/>
           <w:szCs w:val="24"/>
         </w:rPr>
-        <w:t xml:space="preserve">Ratnanagar-7, </w:t>
-      </w:r>
-      <w:proofErr w:type="spellStart"/>
-      <w:r>
-        <w:rPr>
-          <w:rFonts w:ascii="Times New Roman" w:hAnsi="Times New Roman" w:cs="Times New Roman"/>
-          <w:b/>
-          <w:sz w:val="24"/>
-          <w:szCs w:val="24"/>
-        </w:rPr>
-        <w:t>Sauraha</w:t>
-      </w:r>
-      <w:proofErr w:type="spellEnd"/>
-      <w:r>
-        <w:rPr>
-          <w:rFonts w:ascii="Times New Roman" w:hAnsi="Times New Roman" w:cs="Times New Roman"/>
-          <w:b/>
-          <w:sz w:val="24"/>
-          <w:szCs w:val="24"/>
-        </w:rPr>
-        <w:t>, Chitwan</w:t>
+        <w:t>Ratnanagar-7, Sauraha, Chitwan</w:t>
       </w:r>
     </w:p>
     <w:p>
@@ -1228,29 +1208,7 @@
           <w:sz w:val="32"/>
           <w:szCs w:val="32"/>
         </w:rPr>
-        <w:t>Write ‘</w:t>
-      </w:r>
-      <w:proofErr w:type="spellStart"/>
-      <w:r>
-        <w:rPr>
-          <w:rFonts w:ascii="Times New Roman" w:hAnsi="Times New Roman" w:cs="Times New Roman"/>
-          <w:b/>
-          <w:bCs/>
-          <w:sz w:val="32"/>
-          <w:szCs w:val="32"/>
-        </w:rPr>
-        <w:t>en</w:t>
-      </w:r>
-      <w:proofErr w:type="spellEnd"/>
-      <w:r>
-        <w:rPr>
-          <w:rFonts w:ascii="Times New Roman" w:hAnsi="Times New Roman" w:cs="Times New Roman"/>
-          <w:b/>
-          <w:bCs/>
-          <w:sz w:val="32"/>
-          <w:szCs w:val="32"/>
-        </w:rPr>
-        <w:t>’ family words.</w:t>
+        <w:t>Write ‘en’ family words.</w:t>
       </w:r>
       <w:r>
         <w:rPr>
@@ -1913,29 +1871,7 @@
           <w:sz w:val="32"/>
           <w:szCs w:val="32"/>
         </w:rPr>
-        <w:t>2. Circle ‘</w:t>
-      </w:r>
-      <w:proofErr w:type="spellStart"/>
-      <w:r>
-        <w:rPr>
-          <w:rFonts w:ascii="Times New Roman" w:hAnsi="Times New Roman" w:cs="Times New Roman"/>
-          <w:b/>
-          <w:bCs/>
-          <w:sz w:val="32"/>
-          <w:szCs w:val="32"/>
-        </w:rPr>
-        <w:t>ig</w:t>
-      </w:r>
-      <w:proofErr w:type="spellEnd"/>
-      <w:r>
-        <w:rPr>
-          <w:rFonts w:ascii="Times New Roman" w:hAnsi="Times New Roman" w:cs="Times New Roman"/>
-          <w:b/>
-          <w:bCs/>
-          <w:sz w:val="32"/>
-          <w:szCs w:val="32"/>
-        </w:rPr>
-        <w:t>’ family words.</w:t>
+        <w:t>2. Circle ‘ig’ family words.</w:t>
       </w:r>
       <w:r>
         <w:rPr>
@@ -2563,7 +2499,7 @@
           <w:sz w:val="32"/>
           <w:szCs w:val="32"/>
         </w:rPr>
-        <w:t>3. Name the given picture.</w:t>
+        <w:t>3. Name the given picture</w:t>
       </w:r>
       <w:r>
         <w:rPr>
@@ -2573,7 +2509,17 @@
           <w:sz w:val="32"/>
           <w:szCs w:val="32"/>
         </w:rPr>
-        <w:tab/>
+        <w:t>s</w:t>
+      </w:r>
+      <w:r>
+        <w:rPr>
+          <w:rFonts w:ascii="Times New Roman" w:hAnsi="Times New Roman" w:cs="Times New Roman"/>
+          <w:b/>
+          <w:bCs/>
+          <w:sz w:val="32"/>
+          <w:szCs w:val="32"/>
+        </w:rPr>
+        <w:t>.</w:t>
       </w:r>
       <w:r>
         <w:rPr>
@@ -3949,7 +3895,226 @@
         <mc:AlternateContent>
           <mc:Choice Requires="wps">
             <w:drawing>
-              <wp:anchor distT="0" distB="0" distL="114300" distR="114300" simplePos="0" relativeHeight="251711488" behindDoc="0" locked="0" layoutInCell="1" allowOverlap="1" wp14:anchorId="153E5900" wp14:editId="7DC45B80">
+              <wp:anchor distT="0" distB="0" distL="114300" distR="114300" simplePos="0" relativeHeight="251713536" behindDoc="0" locked="0" layoutInCell="1" allowOverlap="1" wp14:anchorId="70E39807" wp14:editId="6B54B4F0">
+                <wp:simplePos x="0" y="0"/>
+                <wp:positionH relativeFrom="column">
+                  <wp:posOffset>4426585</wp:posOffset>
+                </wp:positionH>
+                <wp:positionV relativeFrom="paragraph">
+                  <wp:posOffset>208915</wp:posOffset>
+                </wp:positionV>
+                <wp:extent cx="401955" cy="0"/>
+                <wp:effectExtent l="0" t="0" r="0" b="0"/>
+                <wp:wrapNone/>
+                <wp:docPr id="30" name="Straight Connector 30"/>
+                <wp:cNvGraphicFramePr/>
+                <a:graphic xmlns:a="http://schemas.openxmlformats.org/drawingml/2006/main">
+                  <a:graphicData uri="http://schemas.microsoft.com/office/word/2010/wordprocessingShape">
+                    <wps:wsp>
+                      <wps:cNvCnPr/>
+                      <wps:spPr>
+                        <a:xfrm>
+                          <a:off x="0" y="0"/>
+                          <a:ext cx="401955" cy="0"/>
+                        </a:xfrm>
+                        <a:prstGeom prst="line">
+                          <a:avLst/>
+                        </a:prstGeom>
+                      </wps:spPr>
+                      <wps:style>
+                        <a:lnRef idx="2">
+                          <a:schemeClr val="dk1"/>
+                        </a:lnRef>
+                        <a:fillRef idx="0">
+                          <a:schemeClr val="dk1"/>
+                        </a:fillRef>
+                        <a:effectRef idx="1">
+                          <a:schemeClr val="dk1"/>
+                        </a:effectRef>
+                        <a:fontRef idx="minor">
+                          <a:schemeClr val="tx1"/>
+                        </a:fontRef>
+                      </wps:style>
+                      <wps:bodyPr/>
+                    </wps:wsp>
+                  </a:graphicData>
+                </a:graphic>
+                <wp14:sizeRelH relativeFrom="margin">
+                  <wp14:pctWidth>0</wp14:pctWidth>
+                </wp14:sizeRelH>
+                <wp14:sizeRelV relativeFrom="margin">
+                  <wp14:pctHeight>0</wp14:pctHeight>
+                </wp14:sizeRelV>
+              </wp:anchor>
+            </w:drawing>
+          </mc:Choice>
+          <mc:Fallback>
+            <w:pict>
+              <v:line w14:anchorId="55D6C9C6" id="Straight Connector 30" o:spid="_x0000_s1026" style="position:absolute;z-index:251713536;visibility:visible;mso-wrap-style:square;mso-width-percent:0;mso-height-percent:0;mso-wrap-distance-left:9pt;mso-wrap-distance-top:0;mso-wrap-distance-right:9pt;mso-wrap-distance-bottom:0;mso-position-horizontal:absolute;mso-position-horizontal-relative:text;mso-position-vertical:absolute;mso-position-vertical-relative:text;mso-width-percent:0;mso-height-percent:0;mso-width-relative:margin;mso-height-relative:margin" from="348.55pt,16.45pt" to="380.2pt,16.45pt" o:gfxdata="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" strokecolor="black [3200]" strokeweight="1pt">
+                <v:stroke joinstyle="miter"/>
+              </v:line>
+            </w:pict>
+          </mc:Fallback>
+        </mc:AlternateContent>
+      </w:r>
+      <w:r>
+        <w:rPr>
+          <w:rFonts w:ascii="Times New Roman" w:hAnsi="Times New Roman" w:cs="Times New Roman"/>
+          <w:noProof/>
+          <w:sz w:val="32"/>
+          <w:szCs w:val="32"/>
+          <w:lang w:val="en-US" w:bidi="ne-NP"/>
+        </w:rPr>
+        <mc:AlternateContent>
+          <mc:Choice Requires="wps">
+            <w:drawing>
+              <wp:anchor distT="0" distB="0" distL="114300" distR="114300" simplePos="0" relativeHeight="251699200" behindDoc="0" locked="0" layoutInCell="1" allowOverlap="1" wp14:anchorId="15698FE2" wp14:editId="6DE2D4E5">
+                <wp:simplePos x="0" y="0"/>
+                <wp:positionH relativeFrom="column">
+                  <wp:posOffset>216673</wp:posOffset>
+                </wp:positionH>
+                <wp:positionV relativeFrom="paragraph">
+                  <wp:posOffset>237490</wp:posOffset>
+                </wp:positionV>
+                <wp:extent cx="402336" cy="0"/>
+                <wp:effectExtent l="0" t="0" r="36195" b="19050"/>
+                <wp:wrapNone/>
+                <wp:docPr id="23" name="Straight Connector 23"/>
+                <wp:cNvGraphicFramePr/>
+                <a:graphic xmlns:a="http://schemas.openxmlformats.org/drawingml/2006/main">
+                  <a:graphicData uri="http://schemas.microsoft.com/office/word/2010/wordprocessingShape">
+                    <wps:wsp>
+                      <wps:cNvCnPr/>
+                      <wps:spPr>
+                        <a:xfrm>
+                          <a:off x="0" y="0"/>
+                          <a:ext cx="402336" cy="0"/>
+                        </a:xfrm>
+                        <a:prstGeom prst="line">
+                          <a:avLst/>
+                        </a:prstGeom>
+                      </wps:spPr>
+                      <wps:style>
+                        <a:lnRef idx="2">
+                          <a:schemeClr val="dk1"/>
+                        </a:lnRef>
+                        <a:fillRef idx="0">
+                          <a:schemeClr val="dk1"/>
+                        </a:fillRef>
+                        <a:effectRef idx="1">
+                          <a:schemeClr val="dk1"/>
+                        </a:effectRef>
+                        <a:fontRef idx="minor">
+                          <a:schemeClr val="tx1"/>
+                        </a:fontRef>
+                      </wps:style>
+                      <wps:bodyPr/>
+                    </wps:wsp>
+                  </a:graphicData>
+                </a:graphic>
+                <wp14:sizeRelH relativeFrom="margin">
+                  <wp14:pctWidth>0</wp14:pctWidth>
+                </wp14:sizeRelH>
+                <wp14:sizeRelV relativeFrom="margin">
+                  <wp14:pctHeight>0</wp14:pctHeight>
+                </wp14:sizeRelV>
+              </wp:anchor>
+            </w:drawing>
+          </mc:Choice>
+          <mc:Fallback>
+            <w:pict>
+              <v:line w14:anchorId="3F2AA765" id="Straight Connector 23" o:spid="_x0000_s1026" style="position:absolute;z-index:251699200;visibility:visible;mso-wrap-style:square;mso-width-percent:0;mso-height-percent:0;mso-wrap-distance-left:9pt;mso-wrap-distance-top:0;mso-wrap-distance-right:9pt;mso-wrap-distance-bottom:0;mso-position-horizontal:absolute;mso-position-horizontal-relative:text;mso-position-vertical:absolute;mso-position-vertical-relative:text;mso-width-percent:0;mso-height-percent:0;mso-width-relative:margin;mso-height-relative:margin" from="17.05pt,18.7pt" to="48.75pt,18.7pt" o:gfxdata="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" strokecolor="black [3200]" strokeweight="1pt">
+                <v:stroke joinstyle="miter"/>
+              </v:line>
+            </w:pict>
+          </mc:Fallback>
+        </mc:AlternateContent>
+      </w:r>
+      <w:r>
+        <w:rPr>
+          <w:rFonts w:ascii="Times New Roman" w:hAnsi="Times New Roman" w:cs="Times New Roman"/>
+          <w:noProof/>
+          <w:sz w:val="32"/>
+          <w:szCs w:val="32"/>
+          <w:lang w:val="en-US" w:bidi="ne-NP"/>
+        </w:rPr>
+        <mc:AlternateContent>
+          <mc:Choice Requires="wps">
+            <w:drawing>
+              <wp:anchor distT="0" distB="0" distL="114300" distR="114300" simplePos="0" relativeHeight="251701248" behindDoc="0" locked="0" layoutInCell="1" allowOverlap="1" wp14:anchorId="6CBDB016" wp14:editId="659AA6D0">
+                <wp:simplePos x="0" y="0"/>
+                <wp:positionH relativeFrom="column">
+                  <wp:posOffset>786765</wp:posOffset>
+                </wp:positionH>
+                <wp:positionV relativeFrom="paragraph">
+                  <wp:posOffset>214630</wp:posOffset>
+                </wp:positionV>
+                <wp:extent cx="402336" cy="0"/>
+                <wp:effectExtent l="0" t="0" r="36195" b="19050"/>
+                <wp:wrapNone/>
+                <wp:docPr id="24" name="Straight Connector 24"/>
+                <wp:cNvGraphicFramePr/>
+                <a:graphic xmlns:a="http://schemas.openxmlformats.org/drawingml/2006/main">
+                  <a:graphicData uri="http://schemas.microsoft.com/office/word/2010/wordprocessingShape">
+                    <wps:wsp>
+                      <wps:cNvCnPr/>
+                      <wps:spPr>
+                        <a:xfrm>
+                          <a:off x="0" y="0"/>
+                          <a:ext cx="402336" cy="0"/>
+                        </a:xfrm>
+                        <a:prstGeom prst="line">
+                          <a:avLst/>
+                        </a:prstGeom>
+                      </wps:spPr>
+                      <wps:style>
+                        <a:lnRef idx="2">
+                          <a:schemeClr val="dk1"/>
+                        </a:lnRef>
+                        <a:fillRef idx="0">
+                          <a:schemeClr val="dk1"/>
+                        </a:fillRef>
+                        <a:effectRef idx="1">
+                          <a:schemeClr val="dk1"/>
+                        </a:effectRef>
+                        <a:fontRef idx="minor">
+                          <a:schemeClr val="tx1"/>
+                        </a:fontRef>
+                      </wps:style>
+                      <wps:bodyPr/>
+                    </wps:wsp>
+                  </a:graphicData>
+                </a:graphic>
+                <wp14:sizeRelH relativeFrom="margin">
+                  <wp14:pctWidth>0</wp14:pctWidth>
+                </wp14:sizeRelH>
+                <wp14:sizeRelV relativeFrom="margin">
+                  <wp14:pctHeight>0</wp14:pctHeight>
+                </wp14:sizeRelV>
+              </wp:anchor>
+            </w:drawing>
+          </mc:Choice>
+          <mc:Fallback>
+            <w:pict>
+              <v:line w14:anchorId="1F68983E" id="Straight Connector 24" o:spid="_x0000_s1026" style="position:absolute;z-index:251701248;visibility:visible;mso-wrap-style:square;mso-width-percent:0;mso-height-percent:0;mso-wrap-distance-left:9pt;mso-wrap-distance-top:0;mso-wrap-distance-right:9pt;mso-wrap-distance-bottom:0;mso-position-horizontal:absolute;mso-position-horizontal-relative:text;mso-position-vertical:absolute;mso-position-vertical-relative:text;mso-width-percent:0;mso-height-percent:0;mso-width-relative:margin;mso-height-relative:margin" from="61.95pt,16.9pt" to="93.65pt,16.9pt" o:gfxdata="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" strokecolor="black [3200]" strokeweight="1pt">
+                <v:stroke joinstyle="miter"/>
+              </v:line>
+            </w:pict>
+          </mc:Fallback>
+        </mc:AlternateContent>
+      </w:r>
+      <w:r>
+        <w:rPr>
+          <w:rFonts w:ascii="Times New Roman" w:hAnsi="Times New Roman" w:cs="Times New Roman"/>
+          <w:noProof/>
+          <w:sz w:val="32"/>
+          <w:szCs w:val="32"/>
+          <w:lang w:val="en-US" w:bidi="ne-NP"/>
+        </w:rPr>
+        <mc:AlternateContent>
+          <mc:Choice Requires="wps">
+            <w:drawing>
+              <wp:anchor distT="0" distB="0" distL="114300" distR="114300" simplePos="0" relativeHeight="251711488" behindDoc="0" locked="0" layoutInCell="1" allowOverlap="1" wp14:anchorId="153E5900" wp14:editId="35AC63AA">
                 <wp:simplePos x="0" y="0"/>
                 <wp:positionH relativeFrom="column">
                   <wp:posOffset>3784600</wp:posOffset>
@@ -4004,7 +4169,7 @@
           </mc:Choice>
           <mc:Fallback>
             <w:pict>
-              <v:line w14:anchorId="3FA4AEA0" id="Straight Connector 29" o:spid="_x0000_s1026" style="position:absolute;z-index:251711488;visibility:visible;mso-wrap-style:square;mso-width-percent:0;mso-height-percent:0;mso-wrap-distance-left:9pt;mso-wrap-distance-top:0;mso-wrap-distance-right:9pt;mso-wrap-distance-bottom:0;mso-position-horizontal:absolute;mso-position-horizontal-relative:text;mso-position-vertical:absolute;mso-position-vertical-relative:text;mso-width-percent:0;mso-height-percent:0;mso-width-relative:margin;mso-height-relative:margin" from="298pt,16.5pt" to="329.65pt,16.5pt" o:gfxdata="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" strokecolor="black [3200]" strokeweight="1pt">
+              <v:line w14:anchorId="23A3144C" id="Straight Connector 29" o:spid="_x0000_s1026" style="position:absolute;z-index:251711488;visibility:visible;mso-wrap-style:square;mso-width-percent:0;mso-height-percent:0;mso-wrap-distance-left:9pt;mso-wrap-distance-top:0;mso-wrap-distance-right:9pt;mso-wrap-distance-bottom:0;mso-position-horizontal:absolute;mso-position-horizontal-relative:text;mso-position-vertical:absolute;mso-position-vertical-relative:text;mso-width-percent:0;mso-height-percent:0;mso-width-relative:margin;mso-height-relative:margin" from="298pt,16.5pt" to="329.65pt,16.5pt" o:gfxdata="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" strokecolor="black [3200]" strokeweight="1pt">
                 <v:stroke joinstyle="miter"/>
               </v:line>
             </w:pict>
@@ -4014,225 +4179,6 @@
       <w:r>
         <w:rPr>
           <w:rFonts w:ascii="Times New Roman" w:hAnsi="Times New Roman" w:cs="Times New Roman"/>
-          <w:noProof/>
-          <w:sz w:val="32"/>
-          <w:szCs w:val="32"/>
-          <w:lang w:val="en-US" w:bidi="ne-NP"/>
-        </w:rPr>
-        <mc:AlternateContent>
-          <mc:Choice Requires="wps">
-            <w:drawing>
-              <wp:anchor distT="0" distB="0" distL="114300" distR="114300" simplePos="0" relativeHeight="251713536" behindDoc="0" locked="0" layoutInCell="1" allowOverlap="1" wp14:anchorId="70E39807" wp14:editId="70F7336F">
-                <wp:simplePos x="0" y="0"/>
-                <wp:positionH relativeFrom="column">
-                  <wp:posOffset>4406900</wp:posOffset>
-                </wp:positionH>
-                <wp:positionV relativeFrom="paragraph">
-                  <wp:posOffset>208915</wp:posOffset>
-                </wp:positionV>
-                <wp:extent cx="401955" cy="0"/>
-                <wp:effectExtent l="0" t="0" r="0" b="0"/>
-                <wp:wrapNone/>
-                <wp:docPr id="30" name="Straight Connector 30"/>
-                <wp:cNvGraphicFramePr/>
-                <a:graphic xmlns:a="http://schemas.openxmlformats.org/drawingml/2006/main">
-                  <a:graphicData uri="http://schemas.microsoft.com/office/word/2010/wordprocessingShape">
-                    <wps:wsp>
-                      <wps:cNvCnPr/>
-                      <wps:spPr>
-                        <a:xfrm>
-                          <a:off x="0" y="0"/>
-                          <a:ext cx="401955" cy="0"/>
-                        </a:xfrm>
-                        <a:prstGeom prst="line">
-                          <a:avLst/>
-                        </a:prstGeom>
-                      </wps:spPr>
-                      <wps:style>
-                        <a:lnRef idx="2">
-                          <a:schemeClr val="dk1"/>
-                        </a:lnRef>
-                        <a:fillRef idx="0">
-                          <a:schemeClr val="dk1"/>
-                        </a:fillRef>
-                        <a:effectRef idx="1">
-                          <a:schemeClr val="dk1"/>
-                        </a:effectRef>
-                        <a:fontRef idx="minor">
-                          <a:schemeClr val="tx1"/>
-                        </a:fontRef>
-                      </wps:style>
-                      <wps:bodyPr/>
-                    </wps:wsp>
-                  </a:graphicData>
-                </a:graphic>
-                <wp14:sizeRelH relativeFrom="margin">
-                  <wp14:pctWidth>0</wp14:pctWidth>
-                </wp14:sizeRelH>
-                <wp14:sizeRelV relativeFrom="margin">
-                  <wp14:pctHeight>0</wp14:pctHeight>
-                </wp14:sizeRelV>
-              </wp:anchor>
-            </w:drawing>
-          </mc:Choice>
-          <mc:Fallback>
-            <w:pict>
-              <v:line w14:anchorId="6F8B360B" id="Straight Connector 30" o:spid="_x0000_s1026" style="position:absolute;z-index:251713536;visibility:visible;mso-wrap-style:square;mso-width-percent:0;mso-height-percent:0;mso-wrap-distance-left:9pt;mso-wrap-distance-top:0;mso-wrap-distance-right:9pt;mso-wrap-distance-bottom:0;mso-position-horizontal:absolute;mso-position-horizontal-relative:text;mso-position-vertical:absolute;mso-position-vertical-relative:text;mso-width-percent:0;mso-height-percent:0;mso-width-relative:margin;mso-height-relative:margin" from="347pt,16.45pt" to="378.65pt,16.45pt" o:gfxdata="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" strokecolor="black [3200]" strokeweight="1pt">
-                <v:stroke joinstyle="miter"/>
-              </v:line>
-            </w:pict>
-          </mc:Fallback>
-        </mc:AlternateContent>
-      </w:r>
-      <w:r>
-        <w:rPr>
-          <w:rFonts w:ascii="Times New Roman" w:hAnsi="Times New Roman" w:cs="Times New Roman"/>
-          <w:noProof/>
-          <w:sz w:val="32"/>
-          <w:szCs w:val="32"/>
-          <w:lang w:val="en-US" w:bidi="ne-NP"/>
-        </w:rPr>
-        <mc:AlternateContent>
-          <mc:Choice Requires="wps">
-            <w:drawing>
-              <wp:anchor distT="0" distB="0" distL="114300" distR="114300" simplePos="0" relativeHeight="251701248" behindDoc="0" locked="0" layoutInCell="1" allowOverlap="1" wp14:anchorId="6CBDB016" wp14:editId="61375698">
-                <wp:simplePos x="0" y="0"/>
-                <wp:positionH relativeFrom="column">
-                  <wp:posOffset>1005840</wp:posOffset>
-                </wp:positionH>
-                <wp:positionV relativeFrom="paragraph">
-                  <wp:posOffset>214757</wp:posOffset>
-                </wp:positionV>
-                <wp:extent cx="402336" cy="0"/>
-                <wp:effectExtent l="0" t="0" r="36195" b="19050"/>
-                <wp:wrapNone/>
-                <wp:docPr id="24" name="Straight Connector 24"/>
-                <wp:cNvGraphicFramePr/>
-                <a:graphic xmlns:a="http://schemas.openxmlformats.org/drawingml/2006/main">
-                  <a:graphicData uri="http://schemas.microsoft.com/office/word/2010/wordprocessingShape">
-                    <wps:wsp>
-                      <wps:cNvCnPr/>
-                      <wps:spPr>
-                        <a:xfrm>
-                          <a:off x="0" y="0"/>
-                          <a:ext cx="402336" cy="0"/>
-                        </a:xfrm>
-                        <a:prstGeom prst="line">
-                          <a:avLst/>
-                        </a:prstGeom>
-                      </wps:spPr>
-                      <wps:style>
-                        <a:lnRef idx="2">
-                          <a:schemeClr val="dk1"/>
-                        </a:lnRef>
-                        <a:fillRef idx="0">
-                          <a:schemeClr val="dk1"/>
-                        </a:fillRef>
-                        <a:effectRef idx="1">
-                          <a:schemeClr val="dk1"/>
-                        </a:effectRef>
-                        <a:fontRef idx="minor">
-                          <a:schemeClr val="tx1"/>
-                        </a:fontRef>
-                      </wps:style>
-                      <wps:bodyPr/>
-                    </wps:wsp>
-                  </a:graphicData>
-                </a:graphic>
-                <wp14:sizeRelH relativeFrom="margin">
-                  <wp14:pctWidth>0</wp14:pctWidth>
-                </wp14:sizeRelH>
-                <wp14:sizeRelV relativeFrom="margin">
-                  <wp14:pctHeight>0</wp14:pctHeight>
-                </wp14:sizeRelV>
-              </wp:anchor>
-            </w:drawing>
-          </mc:Choice>
-          <mc:Fallback>
-            <w:pict>
-              <v:line w14:anchorId="501338CE" id="Straight Connector 24" o:spid="_x0000_s1026" style="position:absolute;z-index:251701248;visibility:visible;mso-wrap-style:square;mso-width-percent:0;mso-height-percent:0;mso-wrap-distance-left:9pt;mso-wrap-distance-top:0;mso-wrap-distance-right:9pt;mso-wrap-distance-bottom:0;mso-position-horizontal:absolute;mso-position-horizontal-relative:text;mso-position-vertical:absolute;mso-position-vertical-relative:text;mso-width-percent:0;mso-height-percent:0;mso-width-relative:margin;mso-height-relative:margin" from="79.2pt,16.9pt" to="110.9pt,16.9pt" o:gfxdata="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" strokecolor="black [3200]" strokeweight="1pt">
-                <v:stroke joinstyle="miter"/>
-              </v:line>
-            </w:pict>
-          </mc:Fallback>
-        </mc:AlternateContent>
-      </w:r>
-      <w:r>
-        <w:rPr>
-          <w:rFonts w:ascii="Times New Roman" w:hAnsi="Times New Roman" w:cs="Times New Roman"/>
-          <w:noProof/>
-          <w:sz w:val="32"/>
-          <w:szCs w:val="32"/>
-          <w:lang w:val="en-US" w:bidi="ne-NP"/>
-        </w:rPr>
-        <mc:AlternateContent>
-          <mc:Choice Requires="wps">
-            <w:drawing>
-              <wp:anchor distT="0" distB="0" distL="114300" distR="114300" simplePos="0" relativeHeight="251699200" behindDoc="0" locked="0" layoutInCell="1" allowOverlap="1" wp14:anchorId="15698FE2" wp14:editId="7D2A7780">
-                <wp:simplePos x="0" y="0"/>
-                <wp:positionH relativeFrom="column">
-                  <wp:posOffset>320040</wp:posOffset>
-                </wp:positionH>
-                <wp:positionV relativeFrom="paragraph">
-                  <wp:posOffset>237998</wp:posOffset>
-                </wp:positionV>
-                <wp:extent cx="402336" cy="0"/>
-                <wp:effectExtent l="0" t="0" r="36195" b="19050"/>
-                <wp:wrapNone/>
-                <wp:docPr id="23" name="Straight Connector 23"/>
-                <wp:cNvGraphicFramePr/>
-                <a:graphic xmlns:a="http://schemas.openxmlformats.org/drawingml/2006/main">
-                  <a:graphicData uri="http://schemas.microsoft.com/office/word/2010/wordprocessingShape">
-                    <wps:wsp>
-                      <wps:cNvCnPr/>
-                      <wps:spPr>
-                        <a:xfrm>
-                          <a:off x="0" y="0"/>
-                          <a:ext cx="402336" cy="0"/>
-                        </a:xfrm>
-                        <a:prstGeom prst="line">
-                          <a:avLst/>
-                        </a:prstGeom>
-                      </wps:spPr>
-                      <wps:style>
-                        <a:lnRef idx="2">
-                          <a:schemeClr val="dk1"/>
-                        </a:lnRef>
-                        <a:fillRef idx="0">
-                          <a:schemeClr val="dk1"/>
-                        </a:fillRef>
-                        <a:effectRef idx="1">
-                          <a:schemeClr val="dk1"/>
-                        </a:effectRef>
-                        <a:fontRef idx="minor">
-                          <a:schemeClr val="tx1"/>
-                        </a:fontRef>
-                      </wps:style>
-                      <wps:bodyPr/>
-                    </wps:wsp>
-                  </a:graphicData>
-                </a:graphic>
-                <wp14:sizeRelH relativeFrom="margin">
-                  <wp14:pctWidth>0</wp14:pctWidth>
-                </wp14:sizeRelH>
-                <wp14:sizeRelV relativeFrom="margin">
-                  <wp14:pctHeight>0</wp14:pctHeight>
-                </wp14:sizeRelV>
-              </wp:anchor>
-            </w:drawing>
-          </mc:Choice>
-          <mc:Fallback>
-            <w:pict>
-              <v:line w14:anchorId="3C4E8CC2" id="Straight Connector 23" o:spid="_x0000_s1026" style="position:absolute;z-index:251699200;visibility:visible;mso-wrap-style:square;mso-width-percent:0;mso-height-percent:0;mso-wrap-distance-left:9pt;mso-wrap-distance-top:0;mso-wrap-distance-right:9pt;mso-wrap-distance-bottom:0;mso-position-horizontal:absolute;mso-position-horizontal-relative:text;mso-position-vertical:absolute;mso-position-vertical-relative:text;mso-width-percent:0;mso-height-percent:0;mso-width-relative:margin;mso-height-relative:margin" from="25.2pt,18.75pt" to="56.9pt,18.75pt" o:gfxdata="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" strokecolor="black [3200]" strokeweight="1pt">
-                <v:stroke joinstyle="miter"/>
-              </v:line>
-            </w:pict>
-          </mc:Fallback>
-        </mc:AlternateContent>
-      </w:r>
-      <w:r>
-        <w:rPr>
-          <w:rFonts w:ascii="Times New Roman" w:hAnsi="Times New Roman" w:cs="Times New Roman"/>
           <w:sz w:val="32"/>
           <w:szCs w:val="32"/>
         </w:rPr>
@@ -4246,23 +4192,29 @@
         </w:rPr>
         <w:t xml:space="preserve">       </w:t>
       </w:r>
-      <w:proofErr w:type="spellStart"/>
-      <w:r>
-        <w:rPr>
-          <w:rFonts w:ascii="Times New Roman" w:hAnsi="Times New Roman" w:cs="Times New Roman"/>
-          <w:sz w:val="32"/>
-          <w:szCs w:val="32"/>
-        </w:rPr>
-        <w:t>Wa</w:t>
-      </w:r>
-      <w:proofErr w:type="spellEnd"/>
-      <w:r>
-        <w:rPr>
-          <w:rFonts w:ascii="Times New Roman" w:hAnsi="Times New Roman" w:cs="Times New Roman"/>
-          <w:sz w:val="32"/>
-          <w:szCs w:val="32"/>
-        </w:rPr>
-        <w:t xml:space="preserve">        c         </w:t>
+      <w:r>
+        <w:rPr>
+          <w:rFonts w:ascii="Times New Roman" w:hAnsi="Times New Roman" w:cs="Times New Roman"/>
+          <w:sz w:val="32"/>
+          <w:szCs w:val="32"/>
+        </w:rPr>
+        <w:t xml:space="preserve">         </w:t>
+      </w:r>
+      <w:r>
+        <w:rPr>
+          <w:rFonts w:ascii="Times New Roman" w:hAnsi="Times New Roman" w:cs="Times New Roman"/>
+          <w:sz w:val="32"/>
+          <w:szCs w:val="32"/>
+        </w:rPr>
+        <w:t xml:space="preserve">Wa         </w:t>
+      </w:r>
+      <w:r>
+        <w:rPr>
+          <w:rFonts w:ascii="Times New Roman" w:hAnsi="Times New Roman" w:cs="Times New Roman"/>
+          <w:sz w:val="32"/>
+          <w:szCs w:val="32"/>
+        </w:rPr>
+        <w:t xml:space="preserve">     c </w:t>
       </w:r>
     </w:p>
     <w:p>
@@ -4403,7 +4355,7 @@
         <mc:AlternateContent>
           <mc:Choice Requires="wps">
             <w:drawing>
-              <wp:anchor distT="0" distB="0" distL="114300" distR="114300" simplePos="0" relativeHeight="251692032" behindDoc="0" locked="0" layoutInCell="1" allowOverlap="1" wp14:anchorId="36FEE4CC" wp14:editId="5EFA38BA">
+              <wp:anchor distT="0" distB="0" distL="114300" distR="114300" simplePos="0" relativeHeight="251692032" behindDoc="0" locked="0" layoutInCell="1" allowOverlap="1" wp14:anchorId="36FEE4CC" wp14:editId="252B7EF4">
                 <wp:simplePos x="0" y="0"/>
                 <wp:positionH relativeFrom="margin">
                   <wp:posOffset>1737106</wp:posOffset>
@@ -4437,6 +4389,9 @@
                                     <a14:imgEffect>
                                       <a14:sharpenSoften amount="50000"/>
                                     </a14:imgEffect>
+                                    <a14:imgEffect>
+                                      <a14:brightnessContrast bright="20000" contrast="-40000"/>
+                                    </a14:imgEffect>
                                   </a14:imgLayer>
                                 </a14:imgProps>
                               </a:ext>
@@ -4500,7 +4455,7 @@
           </mc:Choice>
           <mc:Fallback>
             <w:pict>
-              <v:rect w14:anchorId="36FEE4CC" id="Rectangle 19" o:spid="_x0000_s1038" style="position:absolute;margin-left:136.8pt;margin-top:9.65pt;width:65.5pt;height:56.15pt;z-index:251692032;visibility:visible;mso-wrap-style:square;mso-width-percent:0;mso-height-percent:0;mso-wrap-distance-left:9pt;mso-wrap-distance-top:0;mso-wrap-distance-right:9pt;mso-wrap-distance-bottom:0;mso-position-horizontal:absolute;mso-position-horizontal-relative:margin;mso-position-vertical:absolute;mso-position-vertical-relative:text;mso-width-percent:0;mso-height-percent:0;mso-width-relative:margin;mso-height-relative:margin;v-text-anchor:middle" o:gfxdata="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" stroked="f" strokeweight="1pt">
+              <v:rect w14:anchorId="36FEE4CC" id="Rectangle 19" o:spid="_x0000_s1038" style="position:absolute;margin-left:136.8pt;margin-top:9.65pt;width:65.5pt;height:56.15pt;z-index:251692032;visibility:visible;mso-wrap-style:square;mso-width-percent:0;mso-height-percent:0;mso-wrap-distance-left:9pt;mso-wrap-distance-top:0;mso-wrap-distance-right:9pt;mso-wrap-distance-bottom:0;mso-position-horizontal:absolute;mso-position-horizontal-relative:margin;mso-position-vertical:absolute;mso-position-vertical-relative:text;mso-width-percent:0;mso-height-percent:0;mso-width-relative:margin;mso-height-relative:margin;v-text-anchor:middle" o:gfxdata="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" stroked="f" strokeweight="1pt">
                 <v:fill r:id="rId33" o:title="" recolor="t" rotate="t" type="frame"/>
                 <v:textbox>
                   <w:txbxContent>
@@ -4828,7 +4783,23 @@
           <w:sz w:val="32"/>
           <w:szCs w:val="32"/>
         </w:rPr>
-        <w:t xml:space="preserve">N            s                                  </w:t>
+        <w:t xml:space="preserve">N            </w:t>
+      </w:r>
+      <w:r>
+        <w:rPr>
+          <w:rFonts w:ascii="Times New Roman" w:hAnsi="Times New Roman" w:cs="Times New Roman"/>
+          <w:sz w:val="32"/>
+          <w:szCs w:val="32"/>
+        </w:rPr>
+        <w:t xml:space="preserve">  </w:t>
+      </w:r>
+      <w:r>
+        <w:rPr>
+          <w:rFonts w:ascii="Times New Roman" w:hAnsi="Times New Roman" w:cs="Times New Roman"/>
+          <w:sz w:val="32"/>
+          <w:szCs w:val="32"/>
+        </w:rPr>
+        <w:t xml:space="preserve">s                                  </w:t>
       </w:r>
       <w:r>
         <w:rPr>
@@ -4837,6 +4808,14 @@
           <w:szCs w:val="32"/>
         </w:rPr>
         <w:t xml:space="preserve">     </w:t>
+      </w:r>
+      <w:r>
+        <w:rPr>
+          <w:rFonts w:ascii="Times New Roman" w:hAnsi="Times New Roman" w:cs="Times New Roman"/>
+          <w:sz w:val="32"/>
+          <w:szCs w:val="32"/>
+        </w:rPr>
+        <w:t xml:space="preserve">            </w:t>
       </w:r>
       <w:r>
         <w:rPr>
@@ -5312,29 +5291,7 @@
           <w:sz w:val="32"/>
           <w:szCs w:val="32"/>
         </w:rPr>
-        <w:t xml:space="preserve">wer the question in ‘yes, </w:t>
-      </w:r>
-      <w:proofErr w:type="gramStart"/>
-      <w:r>
-        <w:rPr>
-          <w:rFonts w:ascii="Times New Roman" w:hAnsi="Times New Roman" w:cs="Times New Roman"/>
-          <w:b/>
-          <w:bCs/>
-          <w:sz w:val="32"/>
-          <w:szCs w:val="32"/>
-        </w:rPr>
-        <w:t>it</w:t>
-      </w:r>
-      <w:proofErr w:type="gramEnd"/>
-      <w:r>
-        <w:rPr>
-          <w:rFonts w:ascii="Times New Roman" w:hAnsi="Times New Roman" w:cs="Times New Roman"/>
-          <w:b/>
-          <w:bCs/>
-          <w:sz w:val="32"/>
-          <w:szCs w:val="32"/>
-        </w:rPr>
-        <w:t xml:space="preserve"> is’ or ‘No,</w:t>
+        <w:t>wer the question in ‘yes, it is’ or ‘No,</w:t>
       </w:r>
       <w:r>
         <w:rPr>
@@ -5455,16 +5412,16 @@
         <mc:AlternateContent>
           <mc:Choice Requires="wps">
             <w:drawing>
-              <wp:anchor distT="0" distB="0" distL="114300" distR="114300" simplePos="0" relativeHeight="251730944" behindDoc="0" locked="0" layoutInCell="1" allowOverlap="1" wp14:anchorId="17C3ED5E" wp14:editId="1963A2C7">
+              <wp:anchor distT="0" distB="0" distL="114300" distR="114300" simplePos="0" relativeHeight="251730944" behindDoc="0" locked="0" layoutInCell="1" allowOverlap="1" wp14:anchorId="17C3ED5E" wp14:editId="0DAFB0A8">
                 <wp:simplePos x="0" y="0"/>
                 <wp:positionH relativeFrom="column">
-                  <wp:posOffset>357809</wp:posOffset>
+                  <wp:posOffset>354787</wp:posOffset>
                 </wp:positionH>
                 <wp:positionV relativeFrom="paragraph">
-                  <wp:posOffset>115266</wp:posOffset>
+                  <wp:posOffset>116180</wp:posOffset>
                 </wp:positionV>
-                <wp:extent cx="824948" cy="0"/>
-                <wp:effectExtent l="0" t="0" r="32385" b="19050"/>
+                <wp:extent cx="4689043" cy="0"/>
+                <wp:effectExtent l="0" t="0" r="0" b="0"/>
                 <wp:wrapNone/>
                 <wp:docPr id="41" name="Straight Connector 41"/>
                 <wp:cNvGraphicFramePr/>
@@ -5475,7 +5432,7 @@
                       <wps:spPr>
                         <a:xfrm>
                           <a:off x="0" y="0"/>
-                          <a:ext cx="824948" cy="0"/>
+                          <a:ext cx="4689043" cy="0"/>
                         </a:xfrm>
                         <a:prstGeom prst="line">
                           <a:avLst/>
@@ -5499,12 +5456,15 @@
                     </wps:wsp>
                   </a:graphicData>
                 </a:graphic>
+                <wp14:sizeRelH relativeFrom="margin">
+                  <wp14:pctWidth>0</wp14:pctWidth>
+                </wp14:sizeRelH>
               </wp:anchor>
             </w:drawing>
           </mc:Choice>
           <mc:Fallback>
             <w:pict>
-              <v:line w14:anchorId="05627800" id="Straight Connector 41" o:spid="_x0000_s1026" style="position:absolute;z-index:251730944;visibility:visible;mso-wrap-style:square;mso-wrap-distance-left:9pt;mso-wrap-distance-top:0;mso-wrap-distance-right:9pt;mso-wrap-distance-bottom:0;mso-position-horizontal:absolute;mso-position-horizontal-relative:text;mso-position-vertical:absolute;mso-position-vertical-relative:text" from="28.15pt,9.1pt" to="93.1pt,9.1pt" o:gfxdata="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" strokecolor="black [3200]" strokeweight="1pt">
+              <v:line w14:anchorId="4270EA2D" id="Straight Connector 41" o:spid="_x0000_s1026" style="position:absolute;z-index:251730944;visibility:visible;mso-wrap-style:square;mso-width-percent:0;mso-wrap-distance-left:9pt;mso-wrap-distance-top:0;mso-wrap-distance-right:9pt;mso-wrap-distance-bottom:0;mso-position-horizontal:absolute;mso-position-horizontal-relative:text;mso-position-vertical:absolute;mso-position-vertical-relative:text;mso-width-percent:0;mso-width-relative:margin" from="27.95pt,9.15pt" to="397.15pt,9.15pt" o:gfxdata="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" strokecolor="black [3200]" strokeweight="1pt">
                 <v:stroke joinstyle="miter"/>
               </v:line>
             </w:pict>
@@ -5848,16 +5808,16 @@
         <mc:AlternateContent>
           <mc:Choice Requires="wps">
             <w:drawing>
-              <wp:anchor distT="0" distB="0" distL="114300" distR="114300" simplePos="0" relativeHeight="251732992" behindDoc="0" locked="0" layoutInCell="1" allowOverlap="1" wp14:anchorId="252DBCDA" wp14:editId="1E686BC2">
+              <wp:anchor distT="0" distB="0" distL="114300" distR="114300" simplePos="0" relativeHeight="251732992" behindDoc="0" locked="0" layoutInCell="1" allowOverlap="1" wp14:anchorId="252DBCDA" wp14:editId="619AD150">
                 <wp:simplePos x="0" y="0"/>
                 <wp:positionH relativeFrom="column">
-                  <wp:posOffset>347870</wp:posOffset>
+                  <wp:posOffset>347472</wp:posOffset>
                 </wp:positionH>
                 <wp:positionV relativeFrom="paragraph">
-                  <wp:posOffset>119269</wp:posOffset>
+                  <wp:posOffset>115494</wp:posOffset>
                 </wp:positionV>
-                <wp:extent cx="824948" cy="0"/>
-                <wp:effectExtent l="0" t="0" r="32385" b="19050"/>
+                <wp:extent cx="3028493" cy="0"/>
+                <wp:effectExtent l="0" t="0" r="0" b="0"/>
                 <wp:wrapNone/>
                 <wp:docPr id="42" name="Straight Connector 42"/>
                 <wp:cNvGraphicFramePr/>
@@ -5868,7 +5828,7 @@
                       <wps:spPr>
                         <a:xfrm>
                           <a:off x="0" y="0"/>
-                          <a:ext cx="824948" cy="0"/>
+                          <a:ext cx="3028493" cy="0"/>
                         </a:xfrm>
                         <a:prstGeom prst="line">
                           <a:avLst/>
@@ -5892,12 +5852,15 @@
                     </wps:wsp>
                   </a:graphicData>
                 </a:graphic>
+                <wp14:sizeRelH relativeFrom="margin">
+                  <wp14:pctWidth>0</wp14:pctWidth>
+                </wp14:sizeRelH>
               </wp:anchor>
             </w:drawing>
           </mc:Choice>
           <mc:Fallback>
             <w:pict>
-              <v:line w14:anchorId="648E6DC7" id="Straight Connector 42" o:spid="_x0000_s1026" style="position:absolute;z-index:251732992;visibility:visible;mso-wrap-style:square;mso-wrap-distance-left:9pt;mso-wrap-distance-top:0;mso-wrap-distance-right:9pt;mso-wrap-distance-bottom:0;mso-position-horizontal:absolute;mso-position-horizontal-relative:text;mso-position-vertical:absolute;mso-position-vertical-relative:text" from="27.4pt,9.4pt" to="92.35pt,9.4pt" o:gfxdata="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" strokecolor="black [3200]" strokeweight="1pt">
+              <v:line w14:anchorId="298495B7" id="Straight Connector 42" o:spid="_x0000_s1026" style="position:absolute;z-index:251732992;visibility:visible;mso-wrap-style:square;mso-width-percent:0;mso-wrap-distance-left:9pt;mso-wrap-distance-top:0;mso-wrap-distance-right:9pt;mso-wrap-distance-bottom:0;mso-position-horizontal:absolute;mso-position-horizontal-relative:text;mso-position-vertical:absolute;mso-position-vertical-relative:text;mso-width-percent:0;mso-width-relative:margin" from="27.35pt,9.1pt" to="265.8pt,9.1pt" o:gfxdata="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" strokecolor="black [3200]" strokeweight="1pt">
                 <v:stroke joinstyle="miter"/>
               </v:line>
             </w:pict>
@@ -5915,7 +5878,7 @@
         <mc:AlternateContent>
           <mc:Choice Requires="wps">
             <w:drawing>
-              <wp:anchor distT="0" distB="0" distL="114300" distR="114300" simplePos="0" relativeHeight="251722752" behindDoc="0" locked="0" layoutInCell="1" allowOverlap="1" wp14:anchorId="7332AD26" wp14:editId="79BC7567">
+              <wp:anchor distT="0" distB="0" distL="114300" distR="114300" simplePos="0" relativeHeight="251722752" behindDoc="0" locked="0" layoutInCell="1" allowOverlap="1" wp14:anchorId="7332AD26" wp14:editId="0F7BE659">
                 <wp:simplePos x="0" y="0"/>
                 <wp:positionH relativeFrom="margin">
                   <wp:posOffset>144035</wp:posOffset>
@@ -5971,7 +5934,23 @@
           </mc:Choice>
           <mc:Fallback>
             <w:pict>
-              <v:shape w14:anchorId="20E85A50" id="Right Arrow 36" o:spid="_x0000_s1026" type="#_x0000_t13" style="position:absolute;margin-left:11.35pt;margin-top:6.95pt;width:8.6pt;height:3.6pt;z-index:251722752;visibility:visible;mso-wrap-style:square;mso-wrap-distance-left:9pt;mso-wrap-distance-top:0;mso-wrap-distance-right:9pt;mso-wrap-distance-bottom:0;mso-position-horizontal:absolute;mso-position-horizontal-relative:margin;mso-position-vertical:absolute;mso-position-vertical-relative:text;v-text-anchor:middle" o:gfxdata="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" adj="17084" fillcolor="black [3200]" strokecolor="black [1600]" strokeweight="1pt">
+              <v:shapetype w14:anchorId="7941BD3B" id="_x0000_t13" coordsize="21600,21600" o:spt="13" adj="16200,5400" path="m@0,l@0@1,0@1,0@2@0@2@0,21600,21600,10800xe">
+                <v:stroke joinstyle="miter"/>
+                <v:formulas>
+                  <v:f eqn="val #0"/>
+                  <v:f eqn="val #1"/>
+                  <v:f eqn="sum height 0 #1"/>
+                  <v:f eqn="sum 10800 0 #1"/>
+                  <v:f eqn="sum width 0 #0"/>
+                  <v:f eqn="prod @4 @3 10800"/>
+                  <v:f eqn="sum width 0 @5"/>
+                </v:formulas>
+                <v:path o:connecttype="custom" o:connectlocs="@0,0;0,10800;@0,21600;21600,10800" o:connectangles="270,180,90,0" textboxrect="0,@1,@6,@2"/>
+                <v:handles>
+                  <v:h position="#0,#1" xrange="0,21600" yrange="0,10800"/>
+                </v:handles>
+              </v:shapetype>
+              <v:shape id="Right Arrow 36" o:spid="_x0000_s1026" type="#_x0000_t13" style="position:absolute;margin-left:11.35pt;margin-top:6.95pt;width:8.6pt;height:3.6pt;z-index:251722752;visibility:visible;mso-wrap-style:square;mso-wrap-distance-left:9pt;mso-wrap-distance-top:0;mso-wrap-distance-right:9pt;mso-wrap-distance-bottom:0;mso-position-horizontal:absolute;mso-position-horizontal-relative:margin;mso-position-vertical:absolute;mso-position-vertical-relative:text;v-text-anchor:middle" o:gfxdata="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" adj="17084" fillcolor="black [3200]" strokecolor="black [1600]" strokeweight="1pt">
                 <w10:wrap anchorx="margin"/>
               </v:shape>
             </w:pict>
@@ -6024,16 +6003,16 @@
         <mc:AlternateContent>
           <mc:Choice Requires="wps">
             <w:drawing>
-              <wp:anchor distT="0" distB="0" distL="114300" distR="114300" simplePos="0" relativeHeight="251735040" behindDoc="0" locked="0" layoutInCell="1" allowOverlap="1" wp14:anchorId="2C4E8371" wp14:editId="26FAC58C">
+              <wp:anchor distT="0" distB="0" distL="114300" distR="114300" simplePos="0" relativeHeight="251735040" behindDoc="0" locked="0" layoutInCell="1" allowOverlap="1" wp14:anchorId="2C4E8371" wp14:editId="0B5CCF25">
                 <wp:simplePos x="0" y="0"/>
                 <wp:positionH relativeFrom="column">
-                  <wp:posOffset>377686</wp:posOffset>
+                  <wp:posOffset>376733</wp:posOffset>
                 </wp:positionH>
                 <wp:positionV relativeFrom="paragraph">
-                  <wp:posOffset>54665</wp:posOffset>
+                  <wp:posOffset>53467</wp:posOffset>
                 </wp:positionV>
-                <wp:extent cx="824948" cy="0"/>
-                <wp:effectExtent l="0" t="0" r="32385" b="19050"/>
+                <wp:extent cx="2999232" cy="0"/>
+                <wp:effectExtent l="0" t="0" r="0" b="0"/>
                 <wp:wrapNone/>
                 <wp:docPr id="43" name="Straight Connector 43"/>
                 <wp:cNvGraphicFramePr/>
@@ -6044,7 +6023,7 @@
                       <wps:spPr>
                         <a:xfrm>
                           <a:off x="0" y="0"/>
-                          <a:ext cx="824948" cy="0"/>
+                          <a:ext cx="2999232" cy="0"/>
                         </a:xfrm>
                         <a:prstGeom prst="line">
                           <a:avLst/>
@@ -6068,12 +6047,15 @@
                     </wps:wsp>
                   </a:graphicData>
                 </a:graphic>
+                <wp14:sizeRelH relativeFrom="margin">
+                  <wp14:pctWidth>0</wp14:pctWidth>
+                </wp14:sizeRelH>
               </wp:anchor>
             </w:drawing>
           </mc:Choice>
           <mc:Fallback>
             <w:pict>
-              <v:line w14:anchorId="54B0F93F" id="Straight Connector 43" o:spid="_x0000_s1026" style="position:absolute;z-index:251735040;visibility:visible;mso-wrap-style:square;mso-wrap-distance-left:9pt;mso-wrap-distance-top:0;mso-wrap-distance-right:9pt;mso-wrap-distance-bottom:0;mso-position-horizontal:absolute;mso-position-horizontal-relative:text;mso-position-vertical:absolute;mso-position-vertical-relative:text" from="29.75pt,4.3pt" to="94.7pt,4.3pt" o:gfxdata="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" strokecolor="black [3200]" strokeweight="1pt">
+              <v:line w14:anchorId="016CAE73" id="Straight Connector 43" o:spid="_x0000_s1026" style="position:absolute;z-index:251735040;visibility:visible;mso-wrap-style:square;mso-width-percent:0;mso-wrap-distance-left:9pt;mso-wrap-distance-top:0;mso-wrap-distance-right:9pt;mso-wrap-distance-bottom:0;mso-position-horizontal:absolute;mso-position-horizontal-relative:text;mso-position-vertical:absolute;mso-position-vertical-relative:text;mso-width-percent:0;mso-width-relative:margin" from="29.65pt,4.2pt" to="265.8pt,4.2pt" o:gfxdata="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" strokecolor="black [3200]" strokeweight="1pt">
                 <v:stroke joinstyle="miter"/>
               </v:line>
             </w:pict>
@@ -6091,7 +6073,7 @@
         <mc:AlternateContent>
           <mc:Choice Requires="wps">
             <w:drawing>
-              <wp:anchor distT="0" distB="0" distL="114300" distR="114300" simplePos="0" relativeHeight="251724800" behindDoc="0" locked="0" layoutInCell="1" allowOverlap="1" wp14:anchorId="5E7F7A53" wp14:editId="4DF0D6D8">
+              <wp:anchor distT="0" distB="0" distL="114300" distR="114300" simplePos="0" relativeHeight="251724800" behindDoc="0" locked="0" layoutInCell="1" allowOverlap="1" wp14:anchorId="5E7F7A53" wp14:editId="0F529C2D">
                 <wp:simplePos x="0" y="0"/>
                 <wp:positionH relativeFrom="column">
                   <wp:posOffset>173935</wp:posOffset>
@@ -6147,7 +6129,7 @@
           </mc:Choice>
           <mc:Fallback>
             <w:pict>
-              <v:shape w14:anchorId="6574F78F" id="Right Arrow 37" o:spid="_x0000_s1026" type="#_x0000_t13" style="position:absolute;margin-left:13.7pt;margin-top:1.5pt;width:8.6pt;height:3.6pt;z-index:251724800;visibility:visible;mso-wrap-style:square;mso-wrap-distance-left:9pt;mso-wrap-distance-top:0;mso-wrap-distance-right:9pt;mso-wrap-distance-bottom:0;mso-position-horizontal:absolute;mso-position-horizontal-relative:text;mso-position-vertical:absolute;mso-position-vertical-relative:text;v-text-anchor:middle" o:gfxdata="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" adj="17084" fillcolor="black [3200]" strokecolor="black [1600]" strokeweight="1pt"/>
+              <v:shape w14:anchorId="7FB01ED8" id="Right Arrow 37" o:spid="_x0000_s1026" type="#_x0000_t13" style="position:absolute;margin-left:13.7pt;margin-top:1.5pt;width:8.6pt;height:3.6pt;z-index:251724800;visibility:visible;mso-wrap-style:square;mso-wrap-distance-left:9pt;mso-wrap-distance-top:0;mso-wrap-distance-right:9pt;mso-wrap-distance-bottom:0;mso-position-horizontal:absolute;mso-position-horizontal-relative:text;mso-position-vertical:absolute;mso-position-vertical-relative:text;v-text-anchor:middle" o:gfxdata="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" adj="17084" fillcolor="black [3200]" strokecolor="black [1600]" strokeweight="1pt"/>
             </w:pict>
           </mc:Fallback>
         </mc:AlternateContent>
@@ -6181,7 +6163,7 @@
         <mc:AlternateContent>
           <mc:Choice Requires="wps">
             <w:drawing>
-              <wp:anchor distT="0" distB="0" distL="114300" distR="114300" simplePos="0" relativeHeight="251749376" behindDoc="0" locked="0" layoutInCell="1" allowOverlap="1" wp14:anchorId="2481F799" wp14:editId="1C258B33">
+              <wp:anchor distT="0" distB="0" distL="114300" distR="114300" simplePos="0" relativeHeight="251749376" behindDoc="0" locked="0" layoutInCell="1" allowOverlap="1" wp14:anchorId="2481F799" wp14:editId="6F3E2487">
                 <wp:simplePos x="0" y="0"/>
                 <wp:positionH relativeFrom="column">
                   <wp:posOffset>3868420</wp:posOffset>
@@ -6257,7 +6239,7 @@
           </mc:Choice>
           <mc:Fallback>
             <w:pict>
-              <v:rect w14:anchorId="4A407D5B" id="Rectangle 50" o:spid="_x0000_s1026" style="position:absolute;margin-left:304.6pt;margin-top:8.8pt;width:36.4pt;height:47.25pt;z-index:251749376;visibility:visible;mso-wrap-style:square;mso-width-percent:0;mso-height-percent:0;mso-wrap-distance-left:9pt;mso-wrap-distance-top:0;mso-wrap-distance-right:9pt;mso-wrap-distance-bottom:0;mso-position-horizontal:absolute;mso-position-horizontal-relative:text;mso-position-vertical:absolute;mso-position-vertical-relative:text;mso-width-percent:0;mso-height-percent:0;mso-width-relative:margin;mso-height-relative:margin;v-text-anchor:middle" o:gfxdata="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" stroked="f" strokeweight="1pt">
+              <v:rect w14:anchorId="33B1CD7A" id="Rectangle 50" o:spid="_x0000_s1026" style="position:absolute;margin-left:304.6pt;margin-top:8.8pt;width:36.4pt;height:47.25pt;z-index:251749376;visibility:visible;mso-wrap-style:square;mso-width-percent:0;mso-height-percent:0;mso-wrap-distance-left:9pt;mso-wrap-distance-top:0;mso-wrap-distance-right:9pt;mso-wrap-distance-bottom:0;mso-position-horizontal:absolute;mso-position-horizontal-relative:text;mso-position-vertical:absolute;mso-position-vertical-relative:text;mso-width-percent:0;mso-height-percent:0;mso-width-relative:margin;mso-height-relative:margin;v-text-anchor:middle" o:gfxdata="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" stroked="f" strokeweight="1pt">
                 <v:fill r:id="rId44" o:title="" recolor="t" rotate="t" type="frame"/>
               </v:rect>
             </w:pict>
@@ -6270,7 +6252,23 @@
           <w:sz w:val="32"/>
           <w:szCs w:val="32"/>
         </w:rPr>
-        <w:t xml:space="preserve">    (d) Is this a Flower?</w:t>
+        <w:t xml:space="preserve">    (d) Is this a </w:t>
+      </w:r>
+      <w:r>
+        <w:rPr>
+          <w:rFonts w:ascii="Times New Roman" w:hAnsi="Times New Roman" w:cs="Times New Roman"/>
+          <w:sz w:val="32"/>
+          <w:szCs w:val="32"/>
+        </w:rPr>
+        <w:t>f</w:t>
+      </w:r>
+      <w:r>
+        <w:rPr>
+          <w:rFonts w:ascii="Times New Roman" w:hAnsi="Times New Roman" w:cs="Times New Roman"/>
+          <w:sz w:val="32"/>
+          <w:szCs w:val="32"/>
+        </w:rPr>
+        <w:t>lower?</w:t>
       </w:r>
     </w:p>
     <w:p>
@@ -6292,16 +6290,16 @@
         <mc:AlternateContent>
           <mc:Choice Requires="wps">
             <w:drawing>
-              <wp:anchor distT="0" distB="0" distL="114300" distR="114300" simplePos="0" relativeHeight="251737088" behindDoc="0" locked="0" layoutInCell="1" allowOverlap="1" wp14:anchorId="0D5AC32B" wp14:editId="7D795E0D">
+              <wp:anchor distT="0" distB="0" distL="114300" distR="114300" simplePos="0" relativeHeight="251737088" behindDoc="0" locked="0" layoutInCell="1" allowOverlap="1" wp14:anchorId="0D5AC32B" wp14:editId="02837332">
                 <wp:simplePos x="0" y="0"/>
                 <wp:positionH relativeFrom="column">
-                  <wp:posOffset>392595</wp:posOffset>
+                  <wp:posOffset>391363</wp:posOffset>
                 </wp:positionH>
                 <wp:positionV relativeFrom="paragraph">
-                  <wp:posOffset>74902</wp:posOffset>
+                  <wp:posOffset>76175</wp:posOffset>
                 </wp:positionV>
-                <wp:extent cx="824948" cy="0"/>
-                <wp:effectExtent l="0" t="0" r="32385" b="19050"/>
+                <wp:extent cx="3093720" cy="0"/>
+                <wp:effectExtent l="0" t="0" r="0" b="0"/>
                 <wp:wrapNone/>
                 <wp:docPr id="44" name="Straight Connector 44"/>
                 <wp:cNvGraphicFramePr/>
@@ -6312,7 +6310,7 @@
                       <wps:spPr>
                         <a:xfrm>
                           <a:off x="0" y="0"/>
-                          <a:ext cx="824948" cy="0"/>
+                          <a:ext cx="3093720" cy="0"/>
                         </a:xfrm>
                         <a:prstGeom prst="line">
                           <a:avLst/>
@@ -6336,12 +6334,15 @@
                     </wps:wsp>
                   </a:graphicData>
                 </a:graphic>
+                <wp14:sizeRelH relativeFrom="margin">
+                  <wp14:pctWidth>0</wp14:pctWidth>
+                </wp14:sizeRelH>
               </wp:anchor>
             </w:drawing>
           </mc:Choice>
           <mc:Fallback>
             <w:pict>
-              <v:line w14:anchorId="1BF7BFB8" id="Straight Connector 44" o:spid="_x0000_s1026" style="position:absolute;z-index:251737088;visibility:visible;mso-wrap-style:square;mso-wrap-distance-left:9pt;mso-wrap-distance-top:0;mso-wrap-distance-right:9pt;mso-wrap-distance-bottom:0;mso-position-horizontal:absolute;mso-position-horizontal-relative:text;mso-position-vertical:absolute;mso-position-vertical-relative:text" from="30.9pt,5.9pt" to="95.85pt,5.9pt" o:gfxdata="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" strokecolor="black [3200]" strokeweight="1pt">
+              <v:line w14:anchorId="47CCDBE3" id="Straight Connector 44" o:spid="_x0000_s1026" style="position:absolute;z-index:251737088;visibility:visible;mso-wrap-style:square;mso-width-percent:0;mso-wrap-distance-left:9pt;mso-wrap-distance-top:0;mso-wrap-distance-right:9pt;mso-wrap-distance-bottom:0;mso-position-horizontal:absolute;mso-position-horizontal-relative:text;mso-position-vertical:absolute;mso-position-vertical-relative:text;mso-width-percent:0;mso-width-relative:margin" from="30.8pt,6pt" to="274.4pt,6pt" o:gfxdata="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" strokecolor="black [3200]" strokeweight="1pt">
                 <v:stroke joinstyle="miter"/>
               </v:line>
             </w:pict>
@@ -6359,7 +6360,7 @@
         <mc:AlternateContent>
           <mc:Choice Requires="wps">
             <w:drawing>
-              <wp:anchor distT="0" distB="0" distL="114300" distR="114300" simplePos="0" relativeHeight="251726848" behindDoc="0" locked="0" layoutInCell="1" allowOverlap="1" wp14:anchorId="43839F57" wp14:editId="2B6F0200">
+              <wp:anchor distT="0" distB="0" distL="114300" distR="114300" simplePos="0" relativeHeight="251726848" behindDoc="0" locked="0" layoutInCell="1" allowOverlap="1" wp14:anchorId="43839F57" wp14:editId="76A9C3CA">
                 <wp:simplePos x="0" y="0"/>
                 <wp:positionH relativeFrom="column">
                   <wp:posOffset>193813</wp:posOffset>
@@ -6415,7 +6416,7 @@
           </mc:Choice>
           <mc:Fallback>
             <w:pict>
-              <v:shape w14:anchorId="5752AEEC" id="Right Arrow 38" o:spid="_x0000_s1026" type="#_x0000_t13" style="position:absolute;margin-left:15.25pt;margin-top:2.3pt;width:8.6pt;height:3.6pt;z-index:251726848;visibility:visible;mso-wrap-style:square;mso-wrap-distance-left:9pt;mso-wrap-distance-top:0;mso-wrap-distance-right:9pt;mso-wrap-distance-bottom:0;mso-position-horizontal:absolute;mso-position-horizontal-relative:text;mso-position-vertical:absolute;mso-position-vertical-relative:text;v-text-anchor:middle" o:gfxdata="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" adj="17084" fillcolor="black [3200]" strokecolor="black [1600]" strokeweight="1pt"/>
+              <v:shape w14:anchorId="4774F14B" id="Right Arrow 38" o:spid="_x0000_s1026" type="#_x0000_t13" style="position:absolute;margin-left:15.25pt;margin-top:2.3pt;width:8.6pt;height:3.6pt;z-index:251726848;visibility:visible;mso-wrap-style:square;mso-wrap-distance-left:9pt;mso-wrap-distance-top:0;mso-wrap-distance-right:9pt;mso-wrap-distance-bottom:0;mso-position-horizontal:absolute;mso-position-horizontal-relative:text;mso-position-vertical:absolute;mso-position-vertical-relative:text;v-text-anchor:middle" o:gfxdata="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" adj="17084" fillcolor="black [3200]" strokecolor="black [1600]" strokeweight="1pt"/>
             </w:pict>
           </mc:Fallback>
         </mc:AlternateContent>
@@ -6449,7 +6450,7 @@
         <mc:AlternateContent>
           <mc:Choice Requires="wps">
             <w:drawing>
-              <wp:anchor distT="0" distB="0" distL="114300" distR="114300" simplePos="0" relativeHeight="251751424" behindDoc="0" locked="0" layoutInCell="1" allowOverlap="1" wp14:anchorId="1BC12BC7" wp14:editId="6759E743">
+              <wp:anchor distT="0" distB="0" distL="114300" distR="114300" simplePos="0" relativeHeight="251751424" behindDoc="0" locked="0" layoutInCell="1" allowOverlap="1" wp14:anchorId="1BC12BC7" wp14:editId="69C922CD">
                 <wp:simplePos x="0" y="0"/>
                 <wp:positionH relativeFrom="column">
                   <wp:posOffset>3552825</wp:posOffset>
@@ -6525,7 +6526,7 @@
           </mc:Choice>
           <mc:Fallback>
             <w:pict>
-              <v:rect w14:anchorId="769925D3" id="Rectangle 51" o:spid="_x0000_s1026" style="position:absolute;margin-left:279.75pt;margin-top:6.8pt;width:61.1pt;height:66.75pt;z-index:251751424;visibility:visible;mso-wrap-style:square;mso-width-percent:0;mso-height-percent:0;mso-wrap-distance-left:9pt;mso-wrap-distance-top:0;mso-wrap-distance-right:9pt;mso-wrap-distance-bottom:0;mso-position-horizontal:absolute;mso-position-horizontal-relative:text;mso-position-vertical:absolute;mso-position-vertical-relative:text;mso-width-percent:0;mso-height-percent:0;mso-width-relative:margin;mso-height-relative:margin;v-text-anchor:middle" o:gfxdata="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" stroked="f" strokeweight="1pt">
+              <v:rect w14:anchorId="73453710" id="Rectangle 51" o:spid="_x0000_s1026" style="position:absolute;margin-left:279.75pt;margin-top:6.8pt;width:61.1pt;height:66.75pt;z-index:251751424;visibility:visible;mso-wrap-style:square;mso-width-percent:0;mso-height-percent:0;mso-wrap-distance-left:9pt;mso-wrap-distance-top:0;mso-wrap-distance-right:9pt;mso-wrap-distance-bottom:0;mso-position-horizontal:absolute;mso-position-horizontal-relative:text;mso-position-vertical:absolute;mso-position-vertical-relative:text;mso-width-percent:0;mso-height-percent:0;mso-width-relative:margin;mso-height-relative:margin;v-text-anchor:middle" o:gfxdata="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" stroked="f" strokeweight="1pt">
                 <v:fill r:id="rId46" o:title="" recolor="t" rotate="t" type="frame"/>
               </v:rect>
             </w:pict>
@@ -6560,16 +6561,16 @@
         <mc:AlternateContent>
           <mc:Choice Requires="wps">
             <w:drawing>
-              <wp:anchor distT="0" distB="0" distL="114300" distR="114300" simplePos="0" relativeHeight="251739136" behindDoc="0" locked="0" layoutInCell="1" allowOverlap="1" wp14:anchorId="473A1A6D" wp14:editId="341A22E4">
+              <wp:anchor distT="0" distB="0" distL="114300" distR="114300" simplePos="0" relativeHeight="251739136" behindDoc="0" locked="0" layoutInCell="1" allowOverlap="1" wp14:anchorId="473A1A6D" wp14:editId="07E6F3D9">
                 <wp:simplePos x="0" y="0"/>
                 <wp:positionH relativeFrom="column">
-                  <wp:posOffset>392596</wp:posOffset>
+                  <wp:posOffset>391363</wp:posOffset>
                 </wp:positionH>
                 <wp:positionV relativeFrom="paragraph">
-                  <wp:posOffset>49696</wp:posOffset>
+                  <wp:posOffset>51308</wp:posOffset>
                 </wp:positionV>
-                <wp:extent cx="824948" cy="0"/>
-                <wp:effectExtent l="0" t="0" r="32385" b="19050"/>
+                <wp:extent cx="3094330" cy="0"/>
+                <wp:effectExtent l="0" t="0" r="0" b="0"/>
                 <wp:wrapNone/>
                 <wp:docPr id="45" name="Straight Connector 45"/>
                 <wp:cNvGraphicFramePr/>
@@ -6580,7 +6581,7 @@
                       <wps:spPr>
                         <a:xfrm>
                           <a:off x="0" y="0"/>
-                          <a:ext cx="824948" cy="0"/>
+                          <a:ext cx="3094330" cy="0"/>
                         </a:xfrm>
                         <a:prstGeom prst="line">
                           <a:avLst/>
@@ -6604,12 +6605,15 @@
                     </wps:wsp>
                   </a:graphicData>
                 </a:graphic>
+                <wp14:sizeRelH relativeFrom="margin">
+                  <wp14:pctWidth>0</wp14:pctWidth>
+                </wp14:sizeRelH>
               </wp:anchor>
             </w:drawing>
           </mc:Choice>
           <mc:Fallback>
             <w:pict>
-              <v:line w14:anchorId="6ED6B1D5" id="Straight Connector 45" o:spid="_x0000_s1026" style="position:absolute;z-index:251739136;visibility:visible;mso-wrap-style:square;mso-wrap-distance-left:9pt;mso-wrap-distance-top:0;mso-wrap-distance-right:9pt;mso-wrap-distance-bottom:0;mso-position-horizontal:absolute;mso-position-horizontal-relative:text;mso-position-vertical:absolute;mso-position-vertical-relative:text" from="30.9pt,3.9pt" to="95.85pt,3.9pt" o:gfxdata="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" strokecolor="black [3200]" strokeweight="1pt">
+              <v:line w14:anchorId="43AEADF8" id="Straight Connector 45" o:spid="_x0000_s1026" style="position:absolute;z-index:251739136;visibility:visible;mso-wrap-style:square;mso-width-percent:0;mso-wrap-distance-left:9pt;mso-wrap-distance-top:0;mso-wrap-distance-right:9pt;mso-wrap-distance-bottom:0;mso-position-horizontal:absolute;mso-position-horizontal-relative:text;mso-position-vertical:absolute;mso-position-vertical-relative:text;mso-width-percent:0;mso-width-relative:margin" from="30.8pt,4.05pt" to="274.45pt,4.05pt" o:gfxdata="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" strokecolor="black [3200]" strokeweight="1pt">
                 <v:stroke joinstyle="miter"/>
               </v:line>
             </w:pict>
@@ -6724,7 +6728,27 @@
           <w:sz w:val="32"/>
           <w:szCs w:val="32"/>
         </w:rPr>
-        <w:t>6. Make word.</w:t>
+        <w:t>6. Make word</w:t>
+      </w:r>
+      <w:r>
+        <w:rPr>
+          <w:rFonts w:ascii="Times New Roman" w:hAnsi="Times New Roman" w:cs="Times New Roman"/>
+          <w:b/>
+          <w:bCs/>
+          <w:sz w:val="32"/>
+          <w:szCs w:val="32"/>
+        </w:rPr>
+        <w:t>s</w:t>
+      </w:r>
+      <w:r>
+        <w:rPr>
+          <w:rFonts w:ascii="Times New Roman" w:hAnsi="Times New Roman" w:cs="Times New Roman"/>
+          <w:b/>
+          <w:bCs/>
+          <w:sz w:val="32"/>
+          <w:szCs w:val="32"/>
+        </w:rPr>
+        <w:t>.</w:t>
       </w:r>
       <w:r>
         <w:rPr>
@@ -8621,10 +8645,10 @@
         <mc:AlternateContent>
           <mc:Choice Requires="wps">
             <w:drawing>
-              <wp:anchor distT="0" distB="0" distL="114300" distR="114300" simplePos="0" relativeHeight="251797504" behindDoc="0" locked="0" layoutInCell="1" allowOverlap="1" wp14:anchorId="7E5ACAB4" wp14:editId="665E88F0">
+              <wp:anchor distT="0" distB="0" distL="114300" distR="114300" simplePos="0" relativeHeight="251797504" behindDoc="0" locked="0" layoutInCell="1" allowOverlap="1" wp14:anchorId="7E5ACAB4" wp14:editId="16925DE0">
                 <wp:simplePos x="0" y="0"/>
                 <wp:positionH relativeFrom="margin">
-                  <wp:posOffset>1740949</wp:posOffset>
+                  <wp:posOffset>2478964</wp:posOffset>
                 </wp:positionH>
                 <wp:positionV relativeFrom="paragraph">
                   <wp:posOffset>154305</wp:posOffset>
@@ -8676,7 +8700,7 @@
           </mc:Choice>
           <mc:Fallback>
             <w:pict>
-              <v:line w14:anchorId="6BEE7438" id="Straight Connector 83" o:spid="_x0000_s1026" style="position:absolute;flip:y;z-index:251797504;visibility:visible;mso-wrap-style:square;mso-width-percent:0;mso-height-percent:0;mso-wrap-distance-left:9pt;mso-wrap-distance-top:0;mso-wrap-distance-right:9pt;mso-wrap-distance-bottom:0;mso-position-horizontal:absolute;mso-position-horizontal-relative:margin;mso-position-vertical:absolute;mso-position-vertical-relative:text;mso-width-percent:0;mso-height-percent:0;mso-width-relative:margin;mso-height-relative:margin" from="137.1pt,12.15pt" to="193.5pt,12.15pt" o:gfxdata="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" strokecolor="black [3200]" strokeweight="1pt">
+              <v:line w14:anchorId="2B447010" id="Straight Connector 83" o:spid="_x0000_s1026" style="position:absolute;flip:y;z-index:251797504;visibility:visible;mso-wrap-style:square;mso-width-percent:0;mso-height-percent:0;mso-wrap-distance-left:9pt;mso-wrap-distance-top:0;mso-wrap-distance-right:9pt;mso-wrap-distance-bottom:0;mso-position-horizontal:absolute;mso-position-horizontal-relative:margin;mso-position-vertical:absolute;mso-position-vertical-relative:text;mso-width-percent:0;mso-height-percent:0;mso-width-relative:margin;mso-height-relative:margin" from="195.2pt,12.15pt" to="251.6pt,12.15pt" o:gfxdata="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" strokecolor="black [3200]" strokeweight="1pt">
                 <v:stroke joinstyle="miter"/>
                 <w10:wrap anchorx="margin"/>
               </v:line>
@@ -8695,7 +8719,7 @@
         <mc:AlternateContent>
           <mc:Choice Requires="wps">
             <w:drawing>
-              <wp:anchor distT="0" distB="0" distL="114300" distR="114300" simplePos="0" relativeHeight="251791360" behindDoc="0" locked="0" layoutInCell="1" allowOverlap="1" wp14:anchorId="5B6B3822" wp14:editId="69480655">
+              <wp:anchor distT="0" distB="0" distL="114300" distR="114300" simplePos="0" relativeHeight="251791360" behindDoc="0" locked="0" layoutInCell="1" allowOverlap="1" wp14:anchorId="5B6B3822" wp14:editId="04A0F5D8">
                 <wp:simplePos x="0" y="0"/>
                 <wp:positionH relativeFrom="margin">
                   <wp:align>left</wp:align>
@@ -8750,7 +8774,7 @@
           </mc:Choice>
           <mc:Fallback>
             <w:pict>
-              <v:line w14:anchorId="2457F8EF" id="Straight Connector 75" o:spid="_x0000_s1026" style="position:absolute;flip:y;z-index:251791360;visibility:visible;mso-wrap-style:square;mso-width-percent:0;mso-height-percent:0;mso-wrap-distance-left:9pt;mso-wrap-distance-top:0;mso-wrap-distance-right:9pt;mso-wrap-distance-bottom:0;mso-position-horizontal:left;mso-position-horizontal-relative:margin;mso-position-vertical:absolute;mso-position-vertical-relative:text;mso-width-percent:0;mso-height-percent:0;mso-width-relative:margin;mso-height-relative:margin" from="0,11.4pt" to="56.4pt,11.4pt" o:gfxdata="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" strokecolor="black [3200]" strokeweight="1pt">
+              <v:line w14:anchorId="2A453200" id="Straight Connector 75" o:spid="_x0000_s1026" style="position:absolute;flip:y;z-index:251791360;visibility:visible;mso-wrap-style:square;mso-width-percent:0;mso-height-percent:0;mso-wrap-distance-left:9pt;mso-wrap-distance-top:0;mso-wrap-distance-right:9pt;mso-wrap-distance-bottom:0;mso-position-horizontal:left;mso-position-horizontal-relative:margin;mso-position-vertical:absolute;mso-position-vertical-relative:text;mso-width-percent:0;mso-height-percent:0;mso-width-relative:margin;mso-height-relative:margin" from="0,11.4pt" to="56.4pt,11.4pt" o:gfxdata="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" strokecolor="black [3200]" strokeweight="1pt">
                 <v:stroke joinstyle="miter"/>
                 <w10:wrap anchorx="margin"/>
               </v:line>
@@ -8764,7 +8788,23 @@
           <w:sz w:val="32"/>
           <w:szCs w:val="32"/>
         </w:rPr>
-        <w:t xml:space="preserve">                    Ink                                          jug</w:t>
+        <w:t xml:space="preserve">                    </w:t>
+      </w:r>
+      <w:r>
+        <w:rPr>
+          <w:rFonts w:ascii="Times New Roman" w:hAnsi="Times New Roman" w:cs="Times New Roman"/>
+          <w:sz w:val="32"/>
+          <w:szCs w:val="32"/>
+        </w:rPr>
+        <w:t>i</w:t>
+      </w:r>
+      <w:r>
+        <w:rPr>
+          <w:rFonts w:ascii="Times New Roman" w:hAnsi="Times New Roman" w:cs="Times New Roman"/>
+          <w:sz w:val="32"/>
+          <w:szCs w:val="32"/>
+        </w:rPr>
+        <w:t>nk                                          jug</w:t>
       </w:r>
     </w:p>
     <w:p>
@@ -8802,10 +8842,10 @@
         <mc:AlternateContent>
           <mc:Choice Requires="wps">
             <w:drawing>
-              <wp:anchor distT="0" distB="0" distL="114300" distR="114300" simplePos="0" relativeHeight="251799552" behindDoc="0" locked="0" layoutInCell="1" allowOverlap="1" wp14:anchorId="52DB0229" wp14:editId="53B840AB">
+              <wp:anchor distT="0" distB="0" distL="114300" distR="114300" simplePos="0" relativeHeight="251799552" behindDoc="0" locked="0" layoutInCell="1" allowOverlap="1" wp14:anchorId="52DB0229" wp14:editId="05A21F1C">
                 <wp:simplePos x="0" y="0"/>
                 <wp:positionH relativeFrom="margin">
-                  <wp:posOffset>1822465</wp:posOffset>
+                  <wp:posOffset>2560879</wp:posOffset>
                 </wp:positionH>
                 <wp:positionV relativeFrom="paragraph">
                   <wp:posOffset>147955</wp:posOffset>
@@ -8857,7 +8897,7 @@
           </mc:Choice>
           <mc:Fallback>
             <w:pict>
-              <v:line w14:anchorId="15B0EEBA" id="Straight Connector 84" o:spid="_x0000_s1026" style="position:absolute;flip:y;z-index:251799552;visibility:visible;mso-wrap-style:square;mso-width-percent:0;mso-height-percent:0;mso-wrap-distance-left:9pt;mso-wrap-distance-top:0;mso-wrap-distance-right:9pt;mso-wrap-distance-bottom:0;mso-position-horizontal:absolute;mso-position-horizontal-relative:margin;mso-position-vertical:absolute;mso-position-vertical-relative:text;mso-width-percent:0;mso-height-percent:0;mso-width-relative:margin;mso-height-relative:margin" from="143.5pt,11.65pt" to="199.9pt,11.65pt" o:gfxdata="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" strokecolor="black [3200]" strokeweight="1pt">
+              <v:line w14:anchorId="27C43FE8" id="Straight Connector 84" o:spid="_x0000_s1026" style="position:absolute;flip:y;z-index:251799552;visibility:visible;mso-wrap-style:square;mso-width-percent:0;mso-height-percent:0;mso-wrap-distance-left:9pt;mso-wrap-distance-top:0;mso-wrap-distance-right:9pt;mso-wrap-distance-bottom:0;mso-position-horizontal:absolute;mso-position-horizontal-relative:margin;mso-position-vertical:absolute;mso-position-vertical-relative:text;mso-width-percent:0;mso-height-percent:0;mso-width-relative:margin;mso-height-relative:margin" from="201.65pt,11.65pt" to="258.05pt,11.65pt" o:gfxdata="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" strokecolor="black [3200]" strokeweight="1pt">
                 <v:stroke joinstyle="miter"/>
                 <w10:wrap anchorx="margin"/>
               </v:line>
@@ -8876,7 +8916,7 @@
         <mc:AlternateContent>
           <mc:Choice Requires="wps">
             <w:drawing>
-              <wp:anchor distT="0" distB="0" distL="114300" distR="114300" simplePos="0" relativeHeight="251793408" behindDoc="0" locked="0" layoutInCell="1" allowOverlap="1" wp14:anchorId="00A78529" wp14:editId="0B27E743">
+              <wp:anchor distT="0" distB="0" distL="114300" distR="114300" simplePos="0" relativeHeight="251793408" behindDoc="0" locked="0" layoutInCell="1" allowOverlap="1" wp14:anchorId="00A78529" wp14:editId="6E4ED476">
                 <wp:simplePos x="0" y="0"/>
                 <wp:positionH relativeFrom="margin">
                   <wp:align>left</wp:align>
@@ -8931,7 +8971,7 @@
           </mc:Choice>
           <mc:Fallback>
             <w:pict>
-              <v:line w14:anchorId="5C70EAA3" id="Straight Connector 81" o:spid="_x0000_s1026" style="position:absolute;flip:y;z-index:251793408;visibility:visible;mso-wrap-style:square;mso-width-percent:0;mso-height-percent:0;mso-wrap-distance-left:9pt;mso-wrap-distance-top:0;mso-wrap-distance-right:9pt;mso-wrap-distance-bottom:0;mso-position-horizontal:left;mso-position-horizontal-relative:margin;mso-position-vertical:absolute;mso-position-vertical-relative:text;mso-width-percent:0;mso-height-percent:0;mso-width-relative:margin;mso-height-relative:margin" from="0,9.45pt" to="56.4pt,9.45pt" o:gfxdata="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" strokecolor="black [3200]" strokeweight="1pt">
+              <v:line w14:anchorId="7D89D9FD" id="Straight Connector 81" o:spid="_x0000_s1026" style="position:absolute;flip:y;z-index:251793408;visibility:visible;mso-wrap-style:square;mso-width-percent:0;mso-height-percent:0;mso-wrap-distance-left:9pt;mso-wrap-distance-top:0;mso-wrap-distance-right:9pt;mso-wrap-distance-bottom:0;mso-position-horizontal:left;mso-position-horizontal-relative:margin;mso-position-vertical:absolute;mso-position-vertical-relative:text;mso-width-percent:0;mso-height-percent:0;mso-width-relative:margin;mso-height-relative:margin" from="0,9.45pt" to="56.4pt,9.45pt" o:gfxdata="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" strokecolor="black [3200]" strokeweight="1pt">
                 <v:stroke joinstyle="miter"/>
                 <w10:wrap anchorx="margin"/>
               </v:line>
@@ -8945,7 +8985,23 @@
           <w:sz w:val="32"/>
           <w:szCs w:val="32"/>
         </w:rPr>
-        <w:t xml:space="preserve">                    Star                                          apron</w:t>
+        <w:t xml:space="preserve">                    </w:t>
+      </w:r>
+      <w:r>
+        <w:rPr>
+          <w:rFonts w:ascii="Times New Roman" w:hAnsi="Times New Roman" w:cs="Times New Roman"/>
+          <w:sz w:val="32"/>
+          <w:szCs w:val="32"/>
+        </w:rPr>
+        <w:t>s</w:t>
+      </w:r>
+      <w:r>
+        <w:rPr>
+          <w:rFonts w:ascii="Times New Roman" w:hAnsi="Times New Roman" w:cs="Times New Roman"/>
+          <w:sz w:val="32"/>
+          <w:szCs w:val="32"/>
+        </w:rPr>
+        <w:t>tar                                          apron</w:t>
       </w:r>
     </w:p>
     <w:p>
@@ -8970,10 +9026,10 @@
         <mc:AlternateContent>
           <mc:Choice Requires="wps">
             <w:drawing>
-              <wp:anchor distT="0" distB="0" distL="114300" distR="114300" simplePos="0" relativeHeight="251801600" behindDoc="0" locked="0" layoutInCell="1" allowOverlap="1" wp14:anchorId="28DE71A2" wp14:editId="5E95C606">
+              <wp:anchor distT="0" distB="0" distL="114300" distR="114300" simplePos="0" relativeHeight="251801600" behindDoc="0" locked="0" layoutInCell="1" allowOverlap="1" wp14:anchorId="28DE71A2" wp14:editId="30ECF48C">
                 <wp:simplePos x="0" y="0"/>
                 <wp:positionH relativeFrom="margin">
-                  <wp:posOffset>1874919</wp:posOffset>
+                  <wp:posOffset>2612949</wp:posOffset>
                 </wp:positionH>
                 <wp:positionV relativeFrom="paragraph">
                   <wp:posOffset>120015</wp:posOffset>
@@ -9025,7 +9081,7 @@
           </mc:Choice>
           <mc:Fallback>
             <w:pict>
-              <v:line w14:anchorId="722B5E45" id="Straight Connector 85" o:spid="_x0000_s1026" style="position:absolute;flip:y;z-index:251801600;visibility:visible;mso-wrap-style:square;mso-width-percent:0;mso-height-percent:0;mso-wrap-distance-left:9pt;mso-wrap-distance-top:0;mso-wrap-distance-right:9pt;mso-wrap-distance-bottom:0;mso-position-horizontal:absolute;mso-position-horizontal-relative:margin;mso-position-vertical:absolute;mso-position-vertical-relative:text;mso-width-percent:0;mso-height-percent:0;mso-width-relative:margin;mso-height-relative:margin" from="147.65pt,9.45pt" to="204.05pt,9.45pt" o:gfxdata="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" strokecolor="black [3200]" strokeweight="1pt">
+              <v:line w14:anchorId="40C318C6" id="Straight Connector 85" o:spid="_x0000_s1026" style="position:absolute;flip:y;z-index:251801600;visibility:visible;mso-wrap-style:square;mso-width-percent:0;mso-height-percent:0;mso-wrap-distance-left:9pt;mso-wrap-distance-top:0;mso-wrap-distance-right:9pt;mso-wrap-distance-bottom:0;mso-position-horizontal:absolute;mso-position-horizontal-relative:margin;mso-position-vertical:absolute;mso-position-vertical-relative:text;mso-width-percent:0;mso-height-percent:0;mso-width-relative:margin;mso-height-relative:margin" from="205.75pt,9.45pt" to="262.15pt,9.45pt" o:gfxdata="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" strokecolor="black [3200]" strokeweight="1pt">
                 <v:stroke joinstyle="miter"/>
                 <w10:wrap anchorx="margin"/>
               </v:line>
@@ -9113,7 +9169,23 @@
           <w:sz w:val="32"/>
           <w:szCs w:val="32"/>
         </w:rPr>
-        <w:t xml:space="preserve">                     Orange                                    pen </w:t>
+        <w:t xml:space="preserve">                     </w:t>
+      </w:r>
+      <w:r>
+        <w:rPr>
+          <w:rFonts w:ascii="Times New Roman" w:hAnsi="Times New Roman" w:cs="Times New Roman"/>
+          <w:sz w:val="32"/>
+          <w:szCs w:val="32"/>
+        </w:rPr>
+        <w:t>o</w:t>
+      </w:r>
+      <w:r>
+        <w:rPr>
+          <w:rFonts w:ascii="Times New Roman" w:hAnsi="Times New Roman" w:cs="Times New Roman"/>
+          <w:sz w:val="32"/>
+          <w:szCs w:val="32"/>
+        </w:rPr>
+        <w:t xml:space="preserve">range                                    pen </w:t>
       </w:r>
     </w:p>
     <w:p>
@@ -9166,7 +9238,27 @@
           <w:sz w:val="32"/>
           <w:szCs w:val="32"/>
         </w:rPr>
-        <w:t>Match the given picture.</w:t>
+        <w:t>Match the given picture</w:t>
+      </w:r>
+      <w:r>
+        <w:rPr>
+          <w:rFonts w:ascii="Times New Roman" w:hAnsi="Times New Roman" w:cs="Times New Roman"/>
+          <w:b/>
+          <w:bCs/>
+          <w:sz w:val="32"/>
+          <w:szCs w:val="32"/>
+        </w:rPr>
+        <w:t>s</w:t>
+      </w:r>
+      <w:r>
+        <w:rPr>
+          <w:rFonts w:ascii="Times New Roman" w:hAnsi="Times New Roman" w:cs="Times New Roman"/>
+          <w:b/>
+          <w:bCs/>
+          <w:sz w:val="32"/>
+          <w:szCs w:val="32"/>
+        </w:rPr>
+        <w:t>.</w:t>
       </w:r>
       <w:r>
         <w:rPr>
@@ -11189,7 +11281,27 @@
           <w:sz w:val="32"/>
           <w:szCs w:val="32"/>
         </w:rPr>
-        <w:t>21 words from the given letter.</w:t>
+        <w:t>2</w:t>
+      </w:r>
+      <w:r>
+        <w:rPr>
+          <w:rFonts w:ascii="Times New Roman" w:hAnsi="Times New Roman" w:cs="Times New Roman"/>
+          <w:b/>
+          <w:bCs/>
+          <w:sz w:val="32"/>
+          <w:szCs w:val="32"/>
+        </w:rPr>
+        <w:t>/2</w:t>
+      </w:r>
+      <w:r>
+        <w:rPr>
+          <w:rFonts w:ascii="Times New Roman" w:hAnsi="Times New Roman" w:cs="Times New Roman"/>
+          <w:b/>
+          <w:bCs/>
+          <w:sz w:val="32"/>
+          <w:szCs w:val="32"/>
+        </w:rPr>
+        <w:t xml:space="preserve"> words from the given letter.</w:t>
       </w:r>
       <w:r>
         <w:rPr>
@@ -11667,7 +11779,6 @@
           <w:szCs w:val="32"/>
         </w:rPr>
       </w:pPr>
-      <w:proofErr w:type="gramStart"/>
       <w:r>
         <w:rPr>
           <w:rFonts w:ascii="Times New Roman" w:hAnsi="Times New Roman" w:cs="Times New Roman"/>
@@ -11676,7 +11787,6 @@
         </w:rPr>
         <w:t>J  =</w:t>
       </w:r>
-      <w:proofErr w:type="gramEnd"/>
     </w:p>
     <w:p>
       <w:pPr>

</xml_diff>